<commit_message>
Main Menu mit Intro
</commit_message>
<xml_diff>
--- a/Anlagen/Konzept.docx
+++ b/Anlagen/Konzept.docx
@@ -692,19 +692,7 @@
                 <w:rPr>
                   <w:rStyle w:val="Hyperlink"/>
                 </w:rPr>
-                <w:t>https://www.wika.com/de-de/einheiten_u</w:t>
-              </w:r>
-              <w:r>
-                <w:rPr>
-                  <w:rStyle w:val="Hyperlink"/>
-                </w:rPr>
-                <w:t>m</w:t>
-              </w:r>
-              <w:r>
-                <w:rPr>
-                  <w:rStyle w:val="Hyperlink"/>
-                </w:rPr>
-                <w:t>rechner.WIKA</w:t>
+                <w:t>https://www.wika.com/de-de/einheiten_umrechner.WIKA</w:t>
               </w:r>
             </w:hyperlink>
           </w:p>
@@ -827,14 +815,6 @@
             <w:tblPr>
               <w:tblStyle w:val="Tabellenraster"/>
               <w:tblW w:w="0" w:type="auto"/>
-              <w:tblBorders>
-                <w:top w:val="none" w:sz="0" w:space="0" w:color="auto"/>
-                <w:left w:val="none" w:sz="0" w:space="0" w:color="auto"/>
-                <w:bottom w:val="none" w:sz="0" w:space="0" w:color="auto"/>
-                <w:right w:val="none" w:sz="0" w:space="0" w:color="auto"/>
-                <w:insideH w:val="none" w:sz="0" w:space="0" w:color="auto"/>
-                <w:insideV w:val="none" w:sz="0" w:space="0" w:color="auto"/>
-              </w:tblBorders>
               <w:tblLook w:val="04A0" w:firstRow="1" w:lastRow="0" w:firstColumn="1" w:lastColumn="0" w:noHBand="0" w:noVBand="1"/>
             </w:tblPr>
             <w:tblGrid>
@@ -2308,6 +2288,7 @@
               <w:jc w:val="left"/>
             </w:pPr>
             <w:r>
+              <w:lastRenderedPageBreak/>
               <w:t>D. Erwartete Abgaben / Produkte / Ergebnisse</w:t>
             </w:r>
           </w:p>

</xml_diff>